<commit_message>
docs: agregar descripcion del proyecto SaludYa a los 3 documentos de evidencias
Los tres documentos (Markdown y Word) describian la herramienta
(Vitest/Pytest/Docker) pero no el proyecto SaludYa en si. Se agrega
una nueva seccion 1 'Descripcion general del proyecto: SaludYa'
(problema que resuelve, que es, modulos del sistema, stack tecnologico
completo) antes de la descripcion de cada herramienta especifica, y se
renumeran en cascada el resto de secciones en los 6 archivos afectados
(3 .md + 3 .docx), incluyendo las referencias cruzadas internas
('ver seccion N') y la tabla de ubicacion de capturas del README de
entrega-word/. Verificado de nuevo que ningun texto quedo con color
distinto de negro en los .docx.

Co-Authored-By: Claude Sonnet 5 <noreply@anthropic.com>
</commit_message>
<xml_diff>
--- a/docs/evidencias/entrega-word/01-Testing-Frontend-Vitest.docx
+++ b/docs/evidencias/entrega-word/01-Testing-Frontend-Vitest.docx
@@ -332,7 +332,7 @@
           <w:color w:val="000000"/>
           <w:sz w:val="22"/>
         </w:rPr>
-        <w:t>, un sistema web que permite a pacientes agendar, consultar y cancelar citas médicas en línea, y a administradores gestionar médicos, especialidades y citas desde un panel propio.</w:t>
+        <w:t xml:space="preserve"> (descrito con detalle en la sección 2).</w:t>
       </w:r>
     </w:p>
     <w:p>
@@ -396,25 +396,7 @@
           <w:color w:val="000000"/>
           <w:sz w:val="22"/>
         </w:rPr>
-        <w:t xml:space="preserve">El proyecto completo está publicado en el repositorio de GitHub </w:t>
-      </w:r>
-      <w:r>
-        <w:rPr>
-          <w:b/>
-          <w:i w:val="0"/>
-          <w:color w:val="000000"/>
-          <w:sz w:val="22"/>
-        </w:rPr>
-        <w:t>davidcamilo2005/saludya-hospital-portal</w:t>
-      </w:r>
-      <w:r>
-        <w:rPr>
-          <w:b w:val="0"/>
-          <w:i w:val="0"/>
-          <w:color w:val="000000"/>
-          <w:sz w:val="22"/>
-        </w:rPr>
-        <w:t xml:space="preserve">, y este documento se enfoca exclusivamente en la carpeta </w:t>
+        <w:t xml:space="preserve">Este documento se enfoca exclusivamente en la carpeta </w:t>
       </w:r>
       <w:r>
         <w:rPr>
@@ -432,7 +414,7 @@
           <w:color w:val="000000"/>
           <w:sz w:val="22"/>
         </w:rPr>
-        <w:t xml:space="preserve"> de ese repositorio.</w:t>
+        <w:t xml:space="preserve"> del repositorio del proyecto.</w:t>
       </w:r>
     </w:p>
     <w:p>
@@ -443,7 +425,595 @@
         <w:rPr>
           <w:color w:val="000000"/>
         </w:rPr>
-        <w:t>2. Descripción del software: ¿qué es Vitest?</w:t>
+        <w:t>2. Descripción general del proyecto: SaludYa</w:t>
+      </w:r>
+    </w:p>
+    <w:p>
+      <w:pPr>
+        <w:spacing w:after="160"/>
+      </w:pPr>
+      <w:r>
+        <w:rPr>
+          <w:b w:val="0"/>
+          <w:i w:val="0"/>
+          <w:color w:val="000000"/>
+          <w:sz w:val="22"/>
+        </w:rPr>
+        <w:t>Antes de describir la herramienta específica que cubre este documento, es necesario describir el proyecto sobre el cual se aplica, ya que las pruebas y la contenerización no tienen sentido por sí solas: existen para verificar y desplegar un sistema real.</w:t>
+      </w:r>
+    </w:p>
+    <w:p>
+      <w:pPr>
+        <w:pStyle w:val="Heading2"/>
+      </w:pPr>
+      <w:r>
+        <w:rPr>
+          <w:color w:val="000000"/>
+        </w:rPr>
+        <w:t>2.1 Problema que resuelve</w:t>
+      </w:r>
+    </w:p>
+    <w:p>
+      <w:pPr>
+        <w:spacing w:after="160"/>
+      </w:pPr>
+      <w:r>
+        <w:rPr>
+          <w:b w:val="0"/>
+          <w:i w:val="0"/>
+          <w:color w:val="000000"/>
+          <w:sz w:val="22"/>
+        </w:rPr>
+        <w:t>Actualmente, muchas personas deben acudir físicamente a un hospital únicamente para realizar trámites administrativos sencillos: solicitar una cita, consultarla, cancelarla, o simplemente conocer los horarios y especialidades disponibles. Esto provoca congestión en las instalaciones, filas largas, pérdida de tiempo para el paciente, retrasos en la atención y sobrecarga del personal administrativo — recursos que podrían concentrarse en pacientes que realmente requieren atención presencial.</w:t>
+      </w:r>
+    </w:p>
+    <w:p>
+      <w:pPr>
+        <w:pStyle w:val="Heading2"/>
+      </w:pPr>
+      <w:r>
+        <w:rPr>
+          <w:color w:val="000000"/>
+        </w:rPr>
+        <w:t>2.2 Qué es SaludYa</w:t>
+      </w:r>
+    </w:p>
+    <w:p>
+      <w:pPr>
+        <w:spacing w:after="160"/>
+      </w:pPr>
+      <w:r>
+        <w:rPr>
+          <w:b/>
+          <w:i w:val="0"/>
+          <w:color w:val="000000"/>
+          <w:sz w:val="22"/>
+        </w:rPr>
+        <w:t>SaludYa — Portal Web de Gestión Hospitalaria</w:t>
+      </w:r>
+      <w:r>
+        <w:rPr>
+          <w:b w:val="0"/>
+          <w:i w:val="0"/>
+          <w:color w:val="000000"/>
+          <w:sz w:val="22"/>
+        </w:rPr>
+        <w:t xml:space="preserve"> es un sistema web que digitaliza esos trámites administrativos: permite a un paciente registrarse, iniciar sesión, y agendar, consultar y cancelar sus citas médicas en línea; y permite a un administrador del hospital gestionar médicos, especialidades y el flujo completo de citas desde un panel propio. El sistema aplica reglas reales de negocio de un hospital: horario de atención (7:00 a. m. a 5:00 p. m.), prohibición de citas los domingos, y la imposibilidad de que un mismo médico tenga dos citas activas a la misma fecha y hora.</w:t>
+      </w:r>
+    </w:p>
+    <w:p>
+      <w:pPr>
+        <w:pStyle w:val="Heading2"/>
+      </w:pPr>
+      <w:r>
+        <w:rPr>
+          <w:color w:val="000000"/>
+        </w:rPr>
+        <w:t>2.3 Módulos del sistema</w:t>
+      </w:r>
+    </w:p>
+    <w:tbl>
+      <w:tblPr>
+        <w:tblStyle w:val="TableGrid"/>
+        <w:tblW w:type="auto" w:w="0"/>
+        <w:tblLook w:firstColumn="1" w:firstRow="1" w:lastColumn="0" w:lastRow="0" w:noHBand="0" w:noVBand="1" w:val="04A0"/>
+      </w:tblPr>
+      <w:tblGrid>
+        <w:gridCol w:w="4703"/>
+        <w:gridCol w:w="4703"/>
+      </w:tblGrid>
+      <w:tr>
+        <w:tc>
+          <w:tcPr>
+            <w:tcW w:type="dxa" w:w="4703"/>
+            <w:shd w:val="clear" w:color="auto" w:fill="D9D9D9"/>
+          </w:tcPr>
+          <w:p>
+            <w:r>
+              <w:rPr>
+                <w:b/>
+                <w:color w:val="000000"/>
+                <w:sz w:val="20"/>
+              </w:rPr>
+              <w:t>Módulo</w:t>
+            </w:r>
+          </w:p>
+        </w:tc>
+        <w:tc>
+          <w:tcPr>
+            <w:tcW w:type="dxa" w:w="4703"/>
+            <w:shd w:val="clear" w:color="auto" w:fill="D9D9D9"/>
+          </w:tcPr>
+          <w:p>
+            <w:r>
+              <w:rPr>
+                <w:b/>
+                <w:color w:val="000000"/>
+                <w:sz w:val="20"/>
+              </w:rPr>
+              <w:t>Funcionalidades</w:t>
+            </w:r>
+          </w:p>
+        </w:tc>
+      </w:tr>
+      <w:tr>
+        <w:tc>
+          <w:tcPr>
+            <w:tcW w:type="dxa" w:w="4703"/>
+          </w:tcPr>
+          <w:p>
+            <w:r>
+              <w:rPr>
+                <w:color w:val="000000"/>
+                <w:sz w:val="20"/>
+              </w:rPr>
+              <w:t>Público</w:t>
+            </w:r>
+          </w:p>
+        </w:tc>
+        <w:tc>
+          <w:tcPr>
+            <w:tcW w:type="dxa" w:w="4703"/>
+          </w:tcPr>
+          <w:p>
+            <w:r>
+              <w:rPr>
+                <w:color w:val="000000"/>
+                <w:sz w:val="20"/>
+              </w:rPr>
+              <w:t>Landing institucional, historia/misión/visión, listado de especialidades, listado de médicos, contacto, preguntas frecuentes.</w:t>
+            </w:r>
+          </w:p>
+        </w:tc>
+      </w:tr>
+      <w:tr>
+        <w:tc>
+          <w:tcPr>
+            <w:tcW w:type="dxa" w:w="4703"/>
+          </w:tcPr>
+          <w:p>
+            <w:r>
+              <w:rPr>
+                <w:color w:val="000000"/>
+                <w:sz w:val="20"/>
+              </w:rPr>
+              <w:t>Paciente</w:t>
+            </w:r>
+          </w:p>
+        </w:tc>
+        <w:tc>
+          <w:tcPr>
+            <w:tcW w:type="dxa" w:w="4703"/>
+          </w:tcPr>
+          <w:p>
+            <w:r>
+              <w:rPr>
+                <w:color w:val="000000"/>
+                <w:sz w:val="20"/>
+              </w:rPr>
+              <w:t>Registro, inicio de sesión, edición de perfil, agendar cita (validando horario, día y disponibilidad del médico), consultar citas (pendientes e historial) y cancelarlas.</w:t>
+            </w:r>
+          </w:p>
+        </w:tc>
+      </w:tr>
+      <w:tr>
+        <w:tc>
+          <w:tcPr>
+            <w:tcW w:type="dxa" w:w="4703"/>
+          </w:tcPr>
+          <w:p>
+            <w:r>
+              <w:rPr>
+                <w:color w:val="000000"/>
+                <w:sz w:val="20"/>
+              </w:rPr>
+              <w:t>Administrador</w:t>
+            </w:r>
+          </w:p>
+        </w:tc>
+        <w:tc>
+          <w:tcPr>
+            <w:tcW w:type="dxa" w:w="4703"/>
+          </w:tcPr>
+          <w:p>
+            <w:r>
+              <w:rPr>
+                <w:color w:val="000000"/>
+                <w:sz w:val="20"/>
+              </w:rPr>
+              <w:t>Dashboard con métricas en tiempo real, CRUD de médicos, CRUD de especialidades, gestión y cancelación de cualquier cita, administración de pacientes (desactivación de cuentas).</w:t>
+            </w:r>
+          </w:p>
+        </w:tc>
+      </w:tr>
+    </w:tbl>
+    <w:p>
+      <w:pPr>
+        <w:spacing w:after="200"/>
+      </w:pPr>
+    </w:p>
+    <w:p>
+      <w:pPr>
+        <w:pStyle w:val="Heading2"/>
+      </w:pPr>
+      <w:r>
+        <w:rPr>
+          <w:color w:val="000000"/>
+        </w:rPr>
+        <w:t>2.4 Stack tecnológico completo del proyecto</w:t>
+      </w:r>
+    </w:p>
+    <w:tbl>
+      <w:tblPr>
+        <w:tblStyle w:val="TableGrid"/>
+        <w:tblW w:type="auto" w:w="0"/>
+        <w:tblLook w:firstColumn="1" w:firstRow="1" w:lastColumn="0" w:lastRow="0" w:noHBand="0" w:noVBand="1" w:val="04A0"/>
+      </w:tblPr>
+      <w:tblGrid>
+        <w:gridCol w:w="4703"/>
+        <w:gridCol w:w="4703"/>
+      </w:tblGrid>
+      <w:tr>
+        <w:tc>
+          <w:tcPr>
+            <w:tcW w:type="dxa" w:w="4703"/>
+            <w:shd w:val="clear" w:color="auto" w:fill="D9D9D9"/>
+          </w:tcPr>
+          <w:p>
+            <w:r>
+              <w:rPr>
+                <w:b/>
+                <w:color w:val="000000"/>
+                <w:sz w:val="20"/>
+              </w:rPr>
+              <w:t>Capa</w:t>
+            </w:r>
+          </w:p>
+        </w:tc>
+        <w:tc>
+          <w:tcPr>
+            <w:tcW w:type="dxa" w:w="4703"/>
+            <w:shd w:val="clear" w:color="auto" w:fill="D9D9D9"/>
+          </w:tcPr>
+          <w:p>
+            <w:r>
+              <w:rPr>
+                <w:b/>
+                <w:color w:val="000000"/>
+                <w:sz w:val="20"/>
+              </w:rPr>
+              <w:t>Tecnología</w:t>
+            </w:r>
+          </w:p>
+        </w:tc>
+      </w:tr>
+      <w:tr>
+        <w:tc>
+          <w:tcPr>
+            <w:tcW w:type="dxa" w:w="4703"/>
+          </w:tcPr>
+          <w:p>
+            <w:r>
+              <w:rPr>
+                <w:color w:val="000000"/>
+                <w:sz w:val="20"/>
+              </w:rPr>
+              <w:t>Frontend</w:t>
+            </w:r>
+          </w:p>
+        </w:tc>
+        <w:tc>
+          <w:tcPr>
+            <w:tcW w:type="dxa" w:w="4703"/>
+          </w:tcPr>
+          <w:p>
+            <w:r>
+              <w:rPr>
+                <w:color w:val="000000"/>
+                <w:sz w:val="20"/>
+              </w:rPr>
+              <w:t>React 18, Vite, TailwindCSS, Axios, React Router, Vitest, React Testing Library</w:t>
+            </w:r>
+          </w:p>
+        </w:tc>
+      </w:tr>
+      <w:tr>
+        <w:tc>
+          <w:tcPr>
+            <w:tcW w:type="dxa" w:w="4703"/>
+          </w:tcPr>
+          <w:p>
+            <w:r>
+              <w:rPr>
+                <w:color w:val="000000"/>
+                <w:sz w:val="20"/>
+              </w:rPr>
+              <w:t>Backend</w:t>
+            </w:r>
+          </w:p>
+        </w:tc>
+        <w:tc>
+          <w:tcPr>
+            <w:tcW w:type="dxa" w:w="4703"/>
+          </w:tcPr>
+          <w:p>
+            <w:r>
+              <w:rPr>
+                <w:color w:val="000000"/>
+                <w:sz w:val="20"/>
+              </w:rPr>
+              <w:t>Python 3.11, FastAPI, SQLAlchemy 2, Pydantic v2, python-jose (JWT), passlib (bcrypt), Alembic, Pytest</w:t>
+            </w:r>
+          </w:p>
+        </w:tc>
+      </w:tr>
+      <w:tr>
+        <w:tc>
+          <w:tcPr>
+            <w:tcW w:type="dxa" w:w="4703"/>
+          </w:tcPr>
+          <w:p>
+            <w:r>
+              <w:rPr>
+                <w:color w:val="000000"/>
+                <w:sz w:val="20"/>
+              </w:rPr>
+              <w:t>Base de datos</w:t>
+            </w:r>
+          </w:p>
+        </w:tc>
+        <w:tc>
+          <w:tcPr>
+            <w:tcW w:type="dxa" w:w="4703"/>
+          </w:tcPr>
+          <w:p>
+            <w:r>
+              <w:rPr>
+                <w:color w:val="000000"/>
+                <w:sz w:val="20"/>
+              </w:rPr>
+              <w:t>PostgreSQL 15, normalizada hasta 3FN</w:t>
+            </w:r>
+          </w:p>
+        </w:tc>
+      </w:tr>
+      <w:tr>
+        <w:tc>
+          <w:tcPr>
+            <w:tcW w:type="dxa" w:w="4703"/>
+          </w:tcPr>
+          <w:p>
+            <w:r>
+              <w:rPr>
+                <w:color w:val="000000"/>
+                <w:sz w:val="20"/>
+              </w:rPr>
+              <w:t>DevOps</w:t>
+            </w:r>
+          </w:p>
+        </w:tc>
+        <w:tc>
+          <w:tcPr>
+            <w:tcW w:type="dxa" w:w="4703"/>
+          </w:tcPr>
+          <w:p>
+            <w:r>
+              <w:rPr>
+                <w:color w:val="000000"/>
+                <w:sz w:val="20"/>
+              </w:rPr>
+              <w:t>Docker, Docker Compose, Nginx (reverse proxy + SPA), Git, GitHub</w:t>
+            </w:r>
+          </w:p>
+        </w:tc>
+      </w:tr>
+    </w:tbl>
+    <w:p>
+      <w:pPr>
+        <w:spacing w:after="200"/>
+      </w:pPr>
+    </w:p>
+    <w:p>
+      <w:pPr>
+        <w:spacing w:after="160"/>
+      </w:pPr>
+      <w:r>
+        <w:rPr>
+          <w:b w:val="0"/>
+          <w:i w:val="0"/>
+          <w:color w:val="000000"/>
+          <w:sz w:val="22"/>
+        </w:rPr>
+        <w:t>Este documento se enfoca específicamente en uno de esos componentes; los otros dos se documentan, con el mismo nivel de detalle, en los otros dos documentos de esta misma entrega.</w:t>
+      </w:r>
+    </w:p>
+    <w:p>
+      <w:pPr>
+        <w:pStyle w:val="Heading2"/>
+      </w:pPr>
+      <w:r>
+        <w:rPr>
+          <w:color w:val="000000"/>
+        </w:rPr>
+        <w:t>2.5 Arquitectura general (resumen)</w:t>
+      </w:r>
+    </w:p>
+    <w:p>
+      <w:pPr>
+        <w:spacing w:after="160"/>
+      </w:pPr>
+      <w:r>
+        <w:rPr>
+          <w:b w:val="0"/>
+          <w:i w:val="0"/>
+          <w:color w:val="000000"/>
+          <w:sz w:val="22"/>
+        </w:rPr>
+        <w:t xml:space="preserve">El sistema se despliega como tres contenedores independientes que se comunican entre sí: el navegador habla únicamente con el contenedor </w:t>
+      </w:r>
+      <w:r>
+        <w:rPr>
+          <w:b/>
+          <w:i w:val="0"/>
+          <w:color w:val="000000"/>
+          <w:sz w:val="22"/>
+        </w:rPr>
+        <w:t>frontend</w:t>
+      </w:r>
+      <w:r>
+        <w:rPr>
+          <w:b w:val="0"/>
+          <w:i w:val="0"/>
+          <w:color w:val="000000"/>
+          <w:sz w:val="22"/>
+        </w:rPr>
+        <w:t xml:space="preserve"> (Nginx), que sirve la interfaz web y reenvía las llamadas a la API hacia el contenedor </w:t>
+      </w:r>
+      <w:r>
+        <w:rPr>
+          <w:b/>
+          <w:i w:val="0"/>
+          <w:color w:val="000000"/>
+          <w:sz w:val="22"/>
+        </w:rPr>
+        <w:t>backend</w:t>
+      </w:r>
+      <w:r>
+        <w:rPr>
+          <w:b w:val="0"/>
+          <w:i w:val="0"/>
+          <w:color w:val="000000"/>
+          <w:sz w:val="22"/>
+        </w:rPr>
+        <w:t xml:space="preserve"> (FastAPI/Uvicorn), el cual a su vez consulta al contenedor </w:t>
+      </w:r>
+      <w:r>
+        <w:rPr>
+          <w:b/>
+          <w:i w:val="0"/>
+          <w:color w:val="000000"/>
+          <w:sz w:val="22"/>
+        </w:rPr>
+        <w:t>db</w:t>
+      </w:r>
+      <w:r>
+        <w:rPr>
+          <w:b w:val="0"/>
+          <w:i w:val="0"/>
+          <w:color w:val="000000"/>
+          <w:sz w:val="22"/>
+        </w:rPr>
+        <w:t xml:space="preserve"> (PostgreSQL). El backend sigue </w:t>
+      </w:r>
+      <w:r>
+        <w:rPr>
+          <w:b/>
+          <w:i w:val="0"/>
+          <w:color w:val="000000"/>
+          <w:sz w:val="22"/>
+        </w:rPr>
+        <w:t>Clean Architecture</w:t>
+      </w:r>
+      <w:r>
+        <w:rPr>
+          <w:b w:val="0"/>
+          <w:i w:val="0"/>
+          <w:color w:val="000000"/>
+          <w:sz w:val="22"/>
+        </w:rPr>
+        <w:t>: los controladores (routers) nunca acceden a la base de datos directamente, sino a través de una capa de servicios (reglas de negocio) y una capa de repositorios (acceso a datos), separación que se explica en detalle en la documentación técnica del repositorio (docs/ARQUITECTURA.md).</w:t>
+      </w:r>
+    </w:p>
+    <w:p>
+      <w:pPr>
+        <w:pStyle w:val="Heading2"/>
+      </w:pPr>
+      <w:r>
+        <w:rPr>
+          <w:color w:val="000000"/>
+        </w:rPr>
+        <w:t>2.6 Repositorio del proyecto</w:t>
+      </w:r>
+    </w:p>
+    <w:p>
+      <w:pPr>
+        <w:spacing w:after="160"/>
+      </w:pPr>
+      <w:r>
+        <w:rPr>
+          <w:b w:val="0"/>
+          <w:i w:val="0"/>
+          <w:color w:val="000000"/>
+          <w:sz w:val="22"/>
+        </w:rPr>
+        <w:t>El código fuente completo, con su historial de commits, está publicado y es públicamente accesible en:</w:t>
+      </w:r>
+    </w:p>
+    <w:tbl>
+      <w:tblPr>
+        <w:tblStyle w:val="TableGrid"/>
+        <w:tblW w:type="auto" w:w="0"/>
+        <w:tblLook w:firstColumn="1" w:firstRow="1" w:lastColumn="0" w:lastRow="0" w:noHBand="0" w:noVBand="1" w:val="04A0"/>
+      </w:tblPr>
+      <w:tblGrid>
+        <w:gridCol w:w="9406"/>
+      </w:tblGrid>
+      <w:tr>
+        <w:tc>
+          <w:tcPr>
+            <w:tcW w:type="dxa" w:w="9406"/>
+            <w:shd w:val="clear" w:color="auto" w:fill="F2F2F2"/>
+          </w:tcPr>
+          <w:p>
+            <w:pPr>
+              <w:spacing w:after="0"/>
+            </w:pPr>
+            <w:r>
+              <w:rPr>
+                <w:rFonts w:ascii="Consolas" w:hAnsi="Consolas"/>
+                <w:color w:val="000000"/>
+                <w:sz w:val="17"/>
+              </w:rPr>
+              <w:t>https://github.com/davidcamilo2005/saludya-hospital-portal</w:t>
+            </w:r>
+          </w:p>
+        </w:tc>
+      </w:tr>
+    </w:tbl>
+    <w:p>
+      <w:pPr>
+        <w:spacing w:after="120"/>
+      </w:pPr>
+    </w:p>
+    <w:p>
+      <w:pPr>
+        <w:pStyle w:val="Heading1"/>
+      </w:pPr>
+      <w:r>
+        <w:rPr>
+          <w:color w:val="000000"/>
+        </w:rPr>
+        <w:t>3. Descripción del software: ¿qué es Vitest?</w:t>
       </w:r>
     </w:p>
     <w:p>
@@ -545,7 +1115,7 @@
         <w:rPr>
           <w:color w:val="000000"/>
         </w:rPr>
-        <w:t>2.1 Herramientas complementarias utilizadas junto con Vitest</w:t>
+        <w:t>3.1 Herramientas complementarias utilizadas junto con Vitest</w:t>
       </w:r>
     </w:p>
     <w:p>
@@ -857,7 +1427,7 @@
         <w:rPr>
           <w:color w:val="000000"/>
         </w:rPr>
-        <w:t>2.2 Por qué se eligió Vitest y no otra herramienta</w:t>
+        <w:t>3.2 Por qué se eligió Vitest y no otra herramienta</w:t>
       </w:r>
     </w:p>
     <w:p>
@@ -969,7 +1539,7 @@
         <w:rPr>
           <w:color w:val="000000"/>
         </w:rPr>
-        <w:t>3. Rol de Vitest dentro del proyecto SaludYa</w:t>
+        <w:t>4. Rol de Vitest dentro del proyecto SaludYa</w:t>
       </w:r>
     </w:p>
     <w:p>
@@ -1141,7 +1711,7 @@
         <w:rPr>
           <w:color w:val="000000"/>
         </w:rPr>
-        <w:t>4. Entorno de trabajo</w:t>
+        <w:t>5. Entorno de trabajo</w:t>
       </w:r>
     </w:p>
     <w:p>
@@ -1252,7 +1822,7 @@
         <w:rPr>
           <w:color w:val="000000"/>
         </w:rPr>
-        <w:t>5. Instalación y configuración, paso a paso</w:t>
+        <w:t>6. Instalación y configuración, paso a paso</w:t>
       </w:r>
     </w:p>
     <w:p>
@@ -1430,7 +2000,7 @@
         <w:rPr>
           <w:color w:val="000000"/>
         </w:rPr>
-        <w:t>5.1 Configuración de Vitest (frontend/vite.config.js)</w:t>
+        <w:t>6.1 Configuración de Vitest (frontend/vite.config.js)</w:t>
       </w:r>
     </w:p>
     <w:p>
@@ -1607,7 +2177,7 @@
           <w:color w:val="000000"/>
           <w:sz w:val="22"/>
         </w:rPr>
-        <w:t>: le indica a Vitest que debe simular un navegador (usando la librería jsdom explicada en la sección 2.1) para cada prueba, necesario porque los componentes de React solo pueden “renderizarse” dentro de un DOM.</w:t>
+        <w:t>: le indica a Vitest que debe simular un navegador (usando la librería jsdom explicada en la sección 3.1) para cada prueba, necesario porque los componentes de React solo pueden “renderizarse” dentro de un DOM.</w:t>
       </w:r>
     </w:p>
     <w:p>
@@ -1687,7 +2257,7 @@
         <w:rPr>
           <w:color w:val="000000"/>
         </w:rPr>
-        <w:t>6. Dónde se practica este tema dentro del proyecto</w:t>
+        <w:t>7. Dónde se practica este tema dentro del proyecto</w:t>
       </w:r>
     </w:p>
     <w:p>
@@ -2094,7 +2664,7 @@
         <w:rPr>
           <w:color w:val="000000"/>
         </w:rPr>
-        <w:t>7. Guía paso a paso: ejecución de las pruebas</w:t>
+        <w:t>8. Guía paso a paso: ejecución de las pruebas</w:t>
       </w:r>
     </w:p>
     <w:p>
@@ -2108,7 +2678,7 @@
           <w:color w:val="000000"/>
           <w:sz w:val="22"/>
         </w:rPr>
-        <w:t>Con las dependencias ya instaladas (sección 5), ejecutar en la terminal, dentro de frontend/: npm test.</w:t>
+        <w:t>Con las dependencias ya instaladas (sección 6), ejecutar en la terminal, dentro de frontend/: npm test.</w:t>
       </w:r>
     </w:p>
     <w:tbl>
@@ -2344,7 +2914,7 @@
         <w:rPr>
           <w:color w:val="000000"/>
         </w:rPr>
-        <w:t>8. Evidencia real de la ejecución (salida obtenida)</w:t>
+        <w:t>9. Evidencia real de la ejecución (salida obtenida)</w:t>
       </w:r>
     </w:p>
     <w:p>
@@ -2387,7 +2957,7 @@
         <w:rPr>
           <w:color w:val="000000"/>
         </w:rPr>
-        <w:t>8.1 Resultado de npx vitest run --reporter=verbose</w:t>
+        <w:t>9.1 Resultado de npx vitest run --reporter=verbose</w:t>
       </w:r>
     </w:p>
     <w:tbl>
@@ -2871,7 +3441,7 @@
         <w:rPr>
           <w:color w:val="000000"/>
         </w:rPr>
-        <w:t>8.2 Resultado de npm run build (compilación de producción)</w:t>
+        <w:t>9.2 Resultado de npm run build (compilación de producción)</w:t>
       </w:r>
     </w:p>
     <w:tbl>
@@ -2963,7 +3533,7 @@
         <w:rPr>
           <w:color w:val="000000"/>
         </w:rPr>
-        <w:t>8.3 Resultado de npm run lint (calidad de código)</w:t>
+        <w:t>9.3 Resultado de npm run lint (calidad de código)</w:t>
       </w:r>
     </w:p>
     <w:tbl>
@@ -3069,7 +3639,7 @@
         <w:rPr>
           <w:color w:val="000000"/>
         </w:rPr>
-        <w:t>9. Interpretación de resultados</w:t>
+        <w:t>10. Interpretación de resultados</w:t>
       </w:r>
     </w:p>
     <w:tbl>
@@ -3280,7 +3850,7 @@
         <w:rPr>
           <w:color w:val="000000"/>
         </w:rPr>
-        <w:t>10. Comandos de referencia utilizados</w:t>
+        <w:t>11. Comandos de referencia utilizados</w:t>
       </w:r>
     </w:p>
     <w:tbl>
@@ -3372,7 +3942,7 @@
         <w:rPr>
           <w:color w:val="000000"/>
         </w:rPr>
-        <w:t>11. Relación con el resto del proyecto</w:t>
+        <w:t>12. Relación con el resto del proyecto</w:t>
       </w:r>
     </w:p>
     <w:p>
@@ -3433,7 +4003,7 @@
         <w:rPr>
           <w:color w:val="000000"/>
         </w:rPr>
-        <w:t>12. Conclusiones</w:t>
+        <w:t>13. Conclusiones</w:t>
       </w:r>
     </w:p>
     <w:p>
@@ -3500,7 +4070,7 @@
         <w:rPr>
           <w:color w:val="000000"/>
         </w:rPr>
-        <w:t>13. Referencias</w:t>
+        <w:t>14. Referencias</w:t>
       </w:r>
     </w:p>
     <w:p>

</xml_diff>